<commit_message>
BRD V1.3: automatic retry capped at a maximum of 10 attempts
The PO resolved the last open retry value: automatic retrigger up to
10 attempts; the interval stays a backend configuration parameter.
The red "to be confirmed by RB Business" line is removed, both flow
figures and the Figure 2 caption now carry the cap, and the version
history records the decision.

Co-Authored-By: Claude Fable 5 <noreply@anthropic.com>
Claude-Session: https://claude.ai/code/session_01Gsr2gRNUjiFkvLbYu9J5cW
</commit_message>
<xml_diff>
--- a/docs/brd/push_notification/BRD_Push_Notification_V1.3.docx
+++ b/docs/brd/push_notification/BRD_Push_Notification_V1.3.docx
@@ -670,7 +670,7 @@
                 <w:sz w:val="18"/>
                 <w:szCs w:val="18"/>
               </w:rPr>
-              <w:t xml:space="preserve">Business-approved event content of 07/10: Arabic title and body per notification (new section 3.2); P09, P10 and P11 wording per the approval; resuming screen per notification and scope updates; integration items tracked with Reem Bank IT and Avanza outside the BRD</w:t>
+              <w:t xml:space="preserve">Business-approved event content of 07/10: Arabic title and body per notification (new section 3.2); P09, P10 and P11 wording per the approval; resuming screen per notification and scope updates; automatic retry capped at a maximum of 10 attempts (interval remains a backend parameter); integration items tracked with Reem Bank IT and Avanza outside the BRD</w:t>
             </w:r>
           </w:p>
         </w:tc>
@@ -7625,17 +7625,17 @@
         <w:t>X minutes</w:t>
       </w:r>
       <w:r>
-        <w:t xml:space="preserve">, up to </w:t>
+        <w:t xml:space="preserve">, up to a maximum of </w:t>
       </w:r>
       <w:r>
         <w:rPr>
           <w:b/>
           <w:bCs/>
         </w:rPr>
-        <w:t>N attempts</w:t>
-      </w:r>
-      <w:r>
-        <w:t>. The interval and the number of attempts are backend configuration parameters.</w:t>
+        <w:t xml:space="preserve">10 attempts</w:t>
+      </w:r>
+      <w:r>
+        <w:t xml:space="preserve">. The retry interval is a backend configuration parameter.</w:t>
       </w:r>
     </w:p>
     <w:p>
@@ -7685,29 +7685,6 @@
       </w:pPr>
       <w:r>
         <w:t>Every retry reuses the same requestId, so a retry never creates a duplicate notification (BR5).</w:t>
-      </w:r>
-    </w:p>
-    <w:p>
-      <w:pPr>
-        <w:pStyle w:val="ListParagraph"/>
-        <w:numPr>
-          <w:ilvl w:val="1"/>
-          <w:numId w:val="1"/>
-        </w:numPr>
-        <w:spacing w:after="70"/>
-        <w:rPr>
-          <w:b/>
-          <w:bCs/>
-          <w:color w:val="C00000"/>
-        </w:rPr>
-      </w:pPr>
-      <w:r>
-        <w:rPr>
-          <w:b/>
-          <w:bCs/>
-          <w:color w:val="C00000"/>
-        </w:rPr>
-        <w:t>Retry interval (X) and number of attempts (N) – To be confirmed by RB Business</w:t>
       </w:r>
     </w:p>
     <w:p>
@@ -7809,7 +7786,7 @@
           <w:sz w:val="17"/>
           <w:szCs w:val="17"/>
         </w:rPr>
-        <w:t>Figure 2 — Response handling and automatic retry (X and N configurable)</w:t>
+        <w:t xml:space="preserve">Figure 2 — Response handling and automatic retry (automatic retry — maximum 10 attempts; interval configurable)</w:t>
       </w:r>
     </w:p>
     <w:p>

</xml_diff>